<commit_message>
Report: certificate in the capstone-guidelines format (page 27); all other pages unchanged
Co-Authored-By: Claude Sonnet 5.5 <noreply@anthropic.com>
</commit_message>
<xml_diff>
--- a/capstone_submission/55_Silicon Sampling for Indian Public Opinion (editable report).docx
+++ b/capstone_submission/55_Silicon Sampling for Indian Public Opinion (editable report).docx
@@ -561,75 +561,223 @@
     </w:p>
     <w:p>
       <w:pPr>
-        <w:keepNext w:val="0"/>
-        <w:spacing w:after="320" w:before="120" w:line="240" w:lineRule="auto"/>
+        <w:spacing w:after="20" w:before="0" w:line="240" w:lineRule="auto"/>
         <w:jc w:val="center"/>
       </w:pPr>
       <w:r>
         <w:rPr>
           <w:rFonts w:ascii="Times New Roman" w:hAnsi="Times New Roman" w:eastAsia="Times New Roman"/>
           <w:b/>
-          <w:i w:val="0"/>
+          <w:sz w:val="32"/>
+          <w:u w:val="none"/>
+        </w:rPr>
+        <w:t>SVKM’s NMIMS University</w:t>
+      </w:r>
+    </w:p>
+    <w:p>
+      <w:pPr>
+        <w:spacing w:after="80" w:before="0" w:line="240" w:lineRule="auto"/>
+        <w:jc w:val="center"/>
+      </w:pPr>
+      <w:r>
+        <w:rPr>
+          <w:rFonts w:ascii="Times New Roman" w:hAnsi="Times New Roman" w:eastAsia="Times New Roman"/>
+          <w:b w:val="0"/>
+          <w:sz w:val="18"/>
+          <w:u w:val="none"/>
+        </w:rPr>
+        <w:t>(Deemed-to-be University)</w:t>
+      </w:r>
+    </w:p>
+    <w:p>
+      <w:pPr>
+        <w:spacing w:after="120" w:before="0" w:line="240" w:lineRule="auto"/>
+        <w:jc w:val="center"/>
+      </w:pPr>
+      <w:r>
+        <w:drawing>
+          <wp:inline xmlns:a="http://schemas.openxmlformats.org/drawingml/2006/main" xmlns:pic="http://schemas.openxmlformats.org/drawingml/2006/picture">
+            <wp:extent cx="900000" cy="838274"/>
+            <wp:docPr id="6" name="Picture 6"/>
+            <wp:cNvGraphicFramePr>
+              <a:graphicFrameLocks noChangeAspect="1"/>
+            </wp:cNvGraphicFramePr>
+            <a:graphic>
+              <a:graphicData uri="http://schemas.openxmlformats.org/drawingml/2006/picture">
+                <pic:pic>
+                  <pic:nvPicPr>
+                    <pic:cNvPr id="0" name="logo_color.png"/>
+                    <pic:cNvPicPr/>
+                  </pic:nvPicPr>
+                  <pic:blipFill>
+                    <a:blip r:embed="rId17"/>
+                    <a:stretch>
+                      <a:fillRect/>
+                    </a:stretch>
+                  </pic:blipFill>
+                  <pic:spPr>
+                    <a:xfrm>
+                      <a:off x="0" y="0"/>
+                      <a:ext cx="900000" cy="838274"/>
+                    </a:xfrm>
+                    <a:prstGeom prst="rect"/>
+                  </pic:spPr>
+                </pic:pic>
+              </a:graphicData>
+            </a:graphic>
+          </wp:inline>
+        </w:drawing>
+      </w:r>
+    </w:p>
+    <w:p>
+      <w:pPr>
+        <w:spacing w:after="0" w:before="0" w:line="240" w:lineRule="auto"/>
+        <w:jc w:val="center"/>
+      </w:pPr>
+      <w:r>
+        <w:rPr>
+          <w:rFonts w:ascii="Times New Roman" w:hAnsi="Times New Roman" w:eastAsia="Times New Roman"/>
+          <w:b/>
+          <w:sz w:val="26"/>
+          <w:u w:val="none"/>
+        </w:rPr>
+        <w:t>MUKESH PATEL SCHOOL OF TECHNOLOGY</w:t>
+      </w:r>
+    </w:p>
+    <w:p>
+      <w:pPr>
+        <w:spacing w:after="120" w:before="0" w:line="240" w:lineRule="auto"/>
+        <w:jc w:val="center"/>
+      </w:pPr>
+      <w:r>
+        <w:rPr>
+          <w:rFonts w:ascii="Times New Roman" w:hAnsi="Times New Roman" w:eastAsia="Times New Roman"/>
+          <w:b/>
+          <w:sz w:val="26"/>
+          <w:u w:val="none"/>
+        </w:rPr>
+        <w:t>MANAGEMENT &amp; ENGINEERING (MPSTME)</w:t>
+      </w:r>
+    </w:p>
+    <w:p>
+      <w:pPr>
+        <w:spacing w:after="120" w:before="0" w:line="240" w:lineRule="auto"/>
+        <w:jc w:val="center"/>
+      </w:pPr>
+      <w:r>
+        <w:rPr>
+          <w:rFonts w:ascii="Times New Roman" w:hAnsi="Times New Roman" w:eastAsia="Times New Roman"/>
+          <w:b/>
+          <w:sz w:val="26"/>
+          <w:u w:val="none"/>
+        </w:rPr>
+        <w:t>Vile Parle (W), Mumbai-56</w:t>
+      </w:r>
+    </w:p>
+    <w:p>
+      <w:pPr>
+        <w:spacing w:after="160" w:before="0" w:line="240" w:lineRule="auto"/>
+        <w:jc w:val="center"/>
+      </w:pPr>
+      <w:r>
+        <w:rPr>
+          <w:rFonts w:ascii="Times New Roman" w:hAnsi="Times New Roman" w:eastAsia="Times New Roman"/>
+          <w:b/>
+          <w:sz w:val="24"/>
+          <w:u w:val="none"/>
+        </w:rPr>
+        <w:t>(Academic Year 2026-2027)</w:t>
+      </w:r>
+    </w:p>
+    <w:p>
+      <w:pPr>
+        <w:spacing w:after="80" w:before="0" w:line="240" w:lineRule="auto"/>
+        <w:jc w:val="center"/>
+      </w:pPr>
+      <w:r>
+        <w:rPr>
+          <w:rFonts w:ascii="Times New Roman" w:hAnsi="Times New Roman" w:eastAsia="Times New Roman"/>
+          <w:b/>
           <w:sz w:val="28"/>
+          <w:u w:val="single"/>
         </w:rPr>
         <w:t>CERTIFICATE</w:t>
       </w:r>
     </w:p>
     <w:p>
       <w:pPr>
-        <w:keepNext w:val="0"/>
-        <w:spacing w:after="120" w:before="0" w:line="360" w:lineRule="auto"/>
+        <w:spacing w:after="160" w:before="0" w:line="240" w:lineRule="auto"/>
+        <w:jc w:val="center"/>
+      </w:pPr>
+      <w:r>
+        <w:drawing>
+          <wp:inline xmlns:a="http://schemas.openxmlformats.org/drawingml/2006/main" xmlns:pic="http://schemas.openxmlformats.org/drawingml/2006/picture">
+            <wp:extent cx="900000" cy="838274"/>
+            <wp:docPr id="7" name="Picture 7"/>
+            <wp:cNvGraphicFramePr>
+              <a:graphicFrameLocks noChangeAspect="1"/>
+            </wp:cNvGraphicFramePr>
+            <a:graphic>
+              <a:graphicData uri="http://schemas.openxmlformats.org/drawingml/2006/picture">
+                <pic:pic>
+                  <pic:nvPicPr>
+                    <pic:cNvPr id="0" name="logo_color.png"/>
+                    <pic:cNvPicPr/>
+                  </pic:nvPicPr>
+                  <pic:blipFill>
+                    <a:blip r:embed="rId17"/>
+                    <a:stretch>
+                      <a:fillRect/>
+                    </a:stretch>
+                  </pic:blipFill>
+                  <pic:spPr>
+                    <a:xfrm>
+                      <a:off x="0" y="0"/>
+                      <a:ext cx="900000" cy="838274"/>
+                    </a:xfrm>
+                    <a:prstGeom prst="rect"/>
+                  </pic:spPr>
+                </pic:pic>
+              </a:graphicData>
+            </a:graphic>
+          </wp:inline>
+        </w:drawing>
+      </w:r>
+    </w:p>
+    <w:p>
+      <w:pPr>
+        <w:spacing w:after="120" w:before="0" w:line="312" w:lineRule="auto"/>
         <w:jc w:val="both"/>
       </w:pPr>
       <w:r>
         <w:rPr>
           <w:rFonts w:ascii="Times New Roman" w:hAnsi="Times New Roman" w:eastAsia="Times New Roman"/>
           <w:b w:val="0"/>
-          <w:i w:val="0"/>
           <w:sz w:val="24"/>
+          <w:u w:val="none"/>
         </w:rPr>
-        <w:t xml:space="preserve">This is to certify that the capstone project entitled </w:t>
+        <w:t>This is to certify that the project entitled (“Silicon Sampling for Indian Public Opinion”), has been done by the following students of Group 55 under my guidance and supervision &amp; has been submitted in partial fulfilment of the degree of Bachelor of Technology in Computer Engineering of MPSTME, SVKM’s NMIMS (Deemed-to-be University), Mumbai, India.</w:t>
       </w:r>
-      <w:r>
-        <w:rPr>
-          <w:rFonts w:ascii="Times New Roman" w:hAnsi="Times New Roman" w:eastAsia="Times New Roman"/>
-          <w:b/>
-          <w:i w:val="0"/>
-          <w:sz w:val="24"/>
-        </w:rPr>
-        <w:t>“Silicon Sampling for Indian Public Opinion”</w:t>
-      </w:r>
+    </w:p>
+    <w:p>
+      <w:pPr>
+        <w:spacing w:after="40" w:before="0" w:line="288" w:lineRule="auto"/>
+        <w:ind w:left="567"/>
+        <w:jc w:val="left"/>
+      </w:pPr>
       <w:r>
         <w:rPr>
           <w:rFonts w:ascii="Times New Roman" w:hAnsi="Times New Roman" w:eastAsia="Times New Roman"/>
           <w:b w:val="0"/>
-          <w:i w:val="0"/>
           <w:sz w:val="24"/>
-        </w:rPr>
-        <w:t xml:space="preserve"> is a bonafide work carried out by the following students of Group 55, Department of Computer Engineering, Mukesh Patel School of Technology Management &amp; Engineering, NMIMS, during the academic year 2026-2027, under my guidance, in partial fulfilment of the requirements of the Capstone Project.</w:t>
-      </w:r>
-    </w:p>
-    <w:p>
-      <w:pPr>
-        <w:keepNext w:val="0"/>
-        <w:spacing w:after="40" w:before="0" w:line="312" w:lineRule="auto"/>
-        <w:ind w:left="567"/>
-        <w:jc w:val="left"/>
-      </w:pPr>
-      <w:r>
-        <w:rPr>
-          <w:rFonts w:ascii="Times New Roman" w:hAnsi="Times New Roman" w:eastAsia="Times New Roman"/>
-          <w:b w:val="0"/>
-          <w:i w:val="0"/>
-          <w:sz w:val="24"/>
+          <w:u w:val="none"/>
         </w:rPr>
         <w:t>Bhanuj Bhalla  (SAP ID: 70022300017)</w:t>
       </w:r>
     </w:p>
     <w:p>
       <w:pPr>
-        <w:keepNext w:val="0"/>
-        <w:spacing w:after="40" w:before="0" w:line="312" w:lineRule="auto"/>
+        <w:spacing w:after="40" w:before="0" w:line="288" w:lineRule="auto"/>
         <w:ind w:left="567"/>
         <w:jc w:val="left"/>
       </w:pPr>
@@ -637,16 +785,15 @@
         <w:rPr>
           <w:rFonts w:ascii="Times New Roman" w:hAnsi="Times New Roman" w:eastAsia="Times New Roman"/>
           <w:b w:val="0"/>
-          <w:i w:val="0"/>
           <w:sz w:val="24"/>
+          <w:u w:val="none"/>
         </w:rPr>
         <w:t>Ishaan Bansal  (SAP ID: 70022300011)</w:t>
       </w:r>
     </w:p>
     <w:p>
       <w:pPr>
-        <w:keepNext w:val="0"/>
-        <w:spacing w:after="40" w:before="0" w:line="312" w:lineRule="auto"/>
+        <w:spacing w:after="40" w:before="0" w:line="288" w:lineRule="auto"/>
         <w:ind w:left="567"/>
         <w:jc w:val="left"/>
       </w:pPr>
@@ -654,16 +801,15 @@
         <w:rPr>
           <w:rFonts w:ascii="Times New Roman" w:hAnsi="Times New Roman" w:eastAsia="Times New Roman"/>
           <w:b w:val="0"/>
-          <w:i w:val="0"/>
           <w:sz w:val="24"/>
+          <w:u w:val="none"/>
         </w:rPr>
         <w:t>Yash Bhende  (SAP ID: 70022300137)</w:t>
       </w:r>
     </w:p>
     <w:p>
       <w:pPr>
-        <w:keepNext w:val="0"/>
-        <w:spacing w:after="40" w:before="0" w:line="312" w:lineRule="auto"/>
+        <w:spacing w:after="40" w:before="0" w:line="288" w:lineRule="auto"/>
         <w:ind w:left="567"/>
         <w:jc w:val="left"/>
       </w:pPr>
@@ -671,22 +817,22 @@
         <w:rPr>
           <w:rFonts w:ascii="Times New Roman" w:hAnsi="Times New Roman" w:eastAsia="Times New Roman"/>
           <w:b w:val="0"/>
-          <w:i w:val="0"/>
           <w:sz w:val="24"/>
+          <w:u w:val="none"/>
         </w:rPr>
         <w:t>Krishank Ayyella  (SAP ID: 70022300136)</w:t>
       </w:r>
     </w:p>
     <w:p>
       <w:pPr>
-        <w:keepNext w:val="0"/>
-        <w:spacing w:after="720" w:before="0" w:line="360" w:lineRule="auto"/>
-        <w:jc w:val="both"/>
+        <w:spacing w:after="280" w:before="0" w:line="240" w:lineRule="auto"/>
+        <w:jc w:val="center"/>
       </w:pPr>
     </w:p>
     <w:tbl>
       <w:tblPr>
         <w:tblW w:type="auto" w:w="0"/>
+        <w:jc w:val="center"/>
         <w:tblLayout w:type="fixed"/>
         <w:tblLook w:firstColumn="1" w:firstRow="1" w:lastColumn="0" w:lastRow="0" w:noHBand="0" w:noVBand="1" w:val="04A0"/>
       </w:tblPr>
@@ -700,16 +846,57 @@
             <w:tcW w:type="dxa" w:w="4365"/>
           </w:tcPr>
           <w:p>
+            <w:pPr>
+              <w:spacing w:after="20" w:line="240" w:lineRule="auto"/>
+            </w:pPr>
             <w:r>
               <w:rPr>
                 <w:rFonts w:ascii="Times New Roman" w:hAnsi="Times New Roman" w:eastAsia="Times New Roman"/>
                 <w:b w:val="0"/>
-                <w:i w:val="0"/>
-                <w:sz w:val="24"/>
+                <w:sz w:val="22"/>
               </w:rPr>
               <w:br/>
               <w:br/>
               <w:t>_______________________</w:t>
+            </w:r>
+          </w:p>
+          <w:p>
+            <w:pPr>
+              <w:spacing w:after="20" w:line="240" w:lineRule="auto"/>
+            </w:pPr>
+            <w:r>
+              <w:rPr>
+                <w:rFonts w:ascii="Times New Roman" w:hAnsi="Times New Roman" w:eastAsia="Times New Roman"/>
+                <w:b w:val="0"/>
+                <w:sz w:val="22"/>
+              </w:rPr>
+              <w:t>Project mentor (name and Signature)</w:t>
+            </w:r>
+          </w:p>
+          <w:p>
+            <w:pPr>
+              <w:spacing w:after="20" w:line="240" w:lineRule="auto"/>
+            </w:pPr>
+            <w:r>
+              <w:rPr>
+                <w:rFonts w:ascii="Times New Roman" w:hAnsi="Times New Roman" w:eastAsia="Times New Roman"/>
+                <w:b w:val="0"/>
+                <w:sz w:val="22"/>
+              </w:rPr>
+              <w:t>(Internal Guide)</w:t>
+            </w:r>
+          </w:p>
+          <w:p>
+            <w:pPr>
+              <w:spacing w:after="20" w:line="240" w:lineRule="auto"/>
+            </w:pPr>
+            <w:r>
+              <w:rPr>
+                <w:rFonts w:ascii="Times New Roman" w:hAnsi="Times New Roman" w:eastAsia="Times New Roman"/>
+                <w:b/>
+                <w:sz w:val="22"/>
+              </w:rPr>
+              <w:t>Ms. Khushbu Chauhan</w:t>
             </w:r>
           </w:p>
         </w:tc>
@@ -718,16 +905,55 @@
             <w:tcW w:type="dxa" w:w="4365"/>
           </w:tcPr>
           <w:p>
+            <w:pPr>
+              <w:spacing w:after="20" w:line="240" w:lineRule="auto"/>
+            </w:pPr>
             <w:r>
               <w:rPr>
                 <w:rFonts w:ascii="Times New Roman" w:hAnsi="Times New Roman" w:eastAsia="Times New Roman"/>
                 <w:b w:val="0"/>
-                <w:i w:val="0"/>
-                <w:sz w:val="24"/>
+                <w:sz w:val="22"/>
               </w:rPr>
               <w:br/>
               <w:br/>
               <w:t>_______________________</w:t>
+            </w:r>
+          </w:p>
+          <w:p>
+            <w:pPr>
+              <w:spacing w:after="20" w:line="240" w:lineRule="auto"/>
+            </w:pPr>
+            <w:r>
+              <w:rPr>
+                <w:rFonts w:ascii="Times New Roman" w:hAnsi="Times New Roman" w:eastAsia="Times New Roman"/>
+                <w:b w:val="0"/>
+                <w:sz w:val="22"/>
+              </w:rPr>
+              <w:t>Examiner (name and Signature)</w:t>
+            </w:r>
+          </w:p>
+          <w:p>
+            <w:pPr>
+              <w:spacing w:after="20" w:line="240" w:lineRule="auto"/>
+            </w:pPr>
+            <w:r>
+              <w:rPr>
+                <w:rFonts w:ascii="Times New Roman" w:hAnsi="Times New Roman" w:eastAsia="Times New Roman"/>
+                <w:b w:val="0"/>
+                <w:sz w:val="22"/>
+              </w:rPr>
+            </w:r>
+          </w:p>
+          <w:p>
+            <w:pPr>
+              <w:spacing w:after="20" w:line="240" w:lineRule="auto"/>
+            </w:pPr>
+            <w:r>
+              <w:rPr>
+                <w:rFonts w:ascii="Times New Roman" w:hAnsi="Times New Roman" w:eastAsia="Times New Roman"/>
+                <w:b w:val="0"/>
+                <w:sz w:val="22"/>
+              </w:rPr>
             </w:r>
           </w:p>
         </w:tc>
@@ -738,25 +964,41 @@
             <w:tcW w:type="dxa" w:w="4365"/>
           </w:tcPr>
           <w:p>
-            <w:r>
-              <w:rPr>
-                <w:rFonts w:ascii="Times New Roman" w:hAnsi="Times New Roman" w:eastAsia="Times New Roman"/>
-                <w:b/>
-                <w:i w:val="0"/>
-                <w:sz w:val="24"/>
-              </w:rPr>
-              <w:t>Ms. Khushbu Chauhan</w:t>
-            </w:r>
-          </w:p>
-          <w:p>
+            <w:pPr>
+              <w:spacing w:after="20" w:line="240" w:lineRule="auto"/>
+            </w:pPr>
             <w:r>
               <w:rPr>
                 <w:rFonts w:ascii="Times New Roman" w:hAnsi="Times New Roman" w:eastAsia="Times New Roman"/>
                 <w:b w:val="0"/>
-                <w:i w:val="0"/>
                 <w:sz w:val="22"/>
               </w:rPr>
-              <w:t>Project Mentor</w:t>
+            </w:r>
+          </w:p>
+          <w:p>
+            <w:pPr>
+              <w:spacing w:after="20" w:line="240" w:lineRule="auto"/>
+            </w:pPr>
+            <w:r>
+              <w:rPr>
+                <w:rFonts w:ascii="Times New Roman" w:hAnsi="Times New Roman" w:eastAsia="Times New Roman"/>
+                <w:b w:val="0"/>
+                <w:sz w:val="22"/>
+              </w:rPr>
+              <w:t>Date:</w:t>
+            </w:r>
+          </w:p>
+          <w:p>
+            <w:pPr>
+              <w:spacing w:after="20" w:line="240" w:lineRule="auto"/>
+            </w:pPr>
+            <w:r>
+              <w:rPr>
+                <w:rFonts w:ascii="Times New Roman" w:hAnsi="Times New Roman" w:eastAsia="Times New Roman"/>
+                <w:b w:val="0"/>
+                <w:sz w:val="22"/>
+              </w:rPr>
+              <w:t>Place: Mumbai</w:t>
             </w:r>
           </w:p>
         </w:tc>
@@ -764,44 +1006,37 @@
           <w:tcPr>
             <w:tcW w:type="dxa" w:w="4365"/>
           </w:tcPr>
-          <w:p/>
           <w:p>
+            <w:pPr>
+              <w:spacing w:after="20" w:line="240" w:lineRule="auto"/>
+            </w:pPr>
             <w:r>
               <w:rPr>
                 <w:rFonts w:ascii="Times New Roman" w:hAnsi="Times New Roman" w:eastAsia="Times New Roman"/>
                 <w:b w:val="0"/>
-                <w:i w:val="0"/>
                 <w:sz w:val="22"/>
               </w:rPr>
-              <w:t>Head of Department / Capstone Committee</w:t>
+              <w:br/>
+              <w:br/>
+              <w:t>_______________________</w:t>
+            </w:r>
+          </w:p>
+          <w:p>
+            <w:pPr>
+              <w:spacing w:after="20" w:line="240" w:lineRule="auto"/>
+            </w:pPr>
+            <w:r>
+              <w:rPr>
+                <w:rFonts w:ascii="Times New Roman" w:hAnsi="Times New Roman" w:eastAsia="Times New Roman"/>
+                <w:b w:val="0"/>
+                <w:sz w:val="22"/>
+              </w:rPr>
+              <w:t>(HoD) (name and Signature)</w:t>
             </w:r>
           </w:p>
         </w:tc>
       </w:tr>
     </w:tbl>
-    <w:p>
-      <w:pPr>
-        <w:keepNext w:val="0"/>
-        <w:spacing w:after="160" w:before="0" w:line="360" w:lineRule="auto"/>
-        <w:jc w:val="both"/>
-      </w:pPr>
-    </w:p>
-    <w:p>
-      <w:pPr>
-        <w:keepNext w:val="0"/>
-        <w:spacing w:after="120" w:before="0" w:line="312" w:lineRule="auto"/>
-        <w:jc w:val="left"/>
-      </w:pPr>
-      <w:r>
-        <w:rPr>
-          <w:rFonts w:ascii="Times New Roman" w:hAnsi="Times New Roman" w:eastAsia="Times New Roman"/>
-          <w:b w:val="0"/>
-          <w:i w:val="0"/>
-          <w:sz w:val="24"/>
-        </w:rPr>
-        <w:t>Date: ____________________          Place: ____________________</w:t>
-      </w:r>
-    </w:p>
     <w:p>
       <w:r>
         <w:br w:type="page"/>

</xml_diff>